<commit_message>
v2: trace generator with cost+latency; case study with validation results and infrastructure cost table
</commit_message>
<xml_diff>
--- a/docs/AI-Observability-Case-Study.docx
+++ b/docs/AI-Observability-Case-Study.docx
@@ -1082,6 +1082,546 @@
         <w:rPr>
           <w:color w:val="1F3864"/>
         </w:rPr>
+        <w:t xml:space="preserve">Running Cost (Infrastructure)</w:t>
+      </w:r>
+    </w:p>
+    <w:p>
+      <w:pPr>
+        <w:spacing w:after="120"/>
+      </w:pPr>
+      <w:r>
+        <w:rPr>
+          <w:sz w:val="22"/>
+          <w:szCs w:val="22"/>
+        </w:rPr>
+        <w:t xml:space="preserve">The stack runs entirely in the customer's AWS account on a single EC2 instance, so infrastructure cost is transparent and appears on the customer's own AWS bill. Indicative on-demand pricing (us-east-1 / ap-south-1, July 2026; ₹ approximate at ₹84/USD):</w:t>
+      </w:r>
+    </w:p>
+    <w:tbl>
+      <w:tblPr>
+        <w:tblW w:type="dxa" w:w="9360"/>
+        <w:tblBorders>
+          <w:top w:val="single" w:color="auto" w:sz="4"/>
+          <w:left w:val="single" w:color="auto" w:sz="4"/>
+          <w:bottom w:val="single" w:color="auto" w:sz="4"/>
+          <w:right w:val="single" w:color="auto" w:sz="4"/>
+          <w:insideH w:val="single" w:color="auto" w:sz="4"/>
+          <w:insideV w:val="single" w:color="auto" w:sz="4"/>
+        </w:tblBorders>
+      </w:tblPr>
+      <w:tblGrid>
+        <w:gridCol w:w="3120"/>
+        <w:gridCol w:w="2080"/>
+        <w:gridCol w:w="2080"/>
+        <w:gridCol w:w="2080"/>
+      </w:tblGrid>
+      <w:tr>
+        <w:tc>
+          <w:tcPr>
+            <w:tcW w:type="dxa" w:w="3120"/>
+            <w:shd w:fill="1F3864" w:val="clear"/>
+            <w:tcMar>
+              <w:top w:type="dxa" w:w="80"/>
+              <w:left w:type="dxa" w:w="120"/>
+              <w:bottom w:type="dxa" w:w="80"/>
+              <w:right w:type="dxa" w:w="120"/>
+            </w:tcMar>
+          </w:tcPr>
+          <w:p>
+            <w:r>
+              <w:rPr>
+                <w:b/>
+                <w:bCs/>
+                <w:color w:val="FFFFFF"/>
+                <w:sz w:val="21"/>
+                <w:szCs w:val="21"/>
+              </w:rPr>
+              <w:t xml:space="preserve">Configuration</w:t>
+            </w:r>
+          </w:p>
+        </w:tc>
+        <w:tc>
+          <w:tcPr>
+            <w:tcW w:type="dxa" w:w="2080"/>
+            <w:shd w:fill="1F3864" w:val="clear"/>
+            <w:tcMar>
+              <w:top w:type="dxa" w:w="80"/>
+              <w:left w:type="dxa" w:w="120"/>
+              <w:bottom w:type="dxa" w:w="80"/>
+              <w:right w:type="dxa" w:w="120"/>
+            </w:tcMar>
+          </w:tcPr>
+          <w:p>
+            <w:r>
+              <w:rPr>
+                <w:b/>
+                <w:bCs/>
+                <w:color w:val="FFFFFF"/>
+                <w:sz w:val="21"/>
+                <w:szCs w:val="21"/>
+              </w:rPr>
+              <w:t xml:space="preserve">Per hour</w:t>
+            </w:r>
+          </w:p>
+        </w:tc>
+        <w:tc>
+          <w:tcPr>
+            <w:tcW w:type="dxa" w:w="2080"/>
+            <w:shd w:fill="1F3864" w:val="clear"/>
+            <w:tcMar>
+              <w:top w:type="dxa" w:w="80"/>
+              <w:left w:type="dxa" w:w="120"/>
+              <w:bottom w:type="dxa" w:w="80"/>
+              <w:right w:type="dxa" w:w="120"/>
+            </w:tcMar>
+          </w:tcPr>
+          <w:p>
+            <w:r>
+              <w:rPr>
+                <w:b/>
+                <w:bCs/>
+                <w:color w:val="FFFFFF"/>
+                <w:sz w:val="21"/>
+                <w:szCs w:val="21"/>
+              </w:rPr>
+              <w:t xml:space="preserve">Per day (24h)</w:t>
+            </w:r>
+          </w:p>
+        </w:tc>
+        <w:tc>
+          <w:tcPr>
+            <w:tcW w:type="dxa" w:w="2080"/>
+            <w:shd w:fill="1F3864" w:val="clear"/>
+            <w:tcMar>
+              <w:top w:type="dxa" w:w="80"/>
+              <w:left w:type="dxa" w:w="120"/>
+              <w:bottom w:type="dxa" w:w="80"/>
+              <w:right w:type="dxa" w:w="120"/>
+            </w:tcMar>
+          </w:tcPr>
+          <w:p>
+            <w:r>
+              <w:rPr>
+                <w:b/>
+                <w:bCs/>
+                <w:color w:val="FFFFFF"/>
+                <w:sz w:val="21"/>
+                <w:szCs w:val="21"/>
+              </w:rPr>
+              <w:t xml:space="preserve">Per month (24×7)</w:t>
+            </w:r>
+          </w:p>
+        </w:tc>
+      </w:tr>
+      <w:tr>
+        <w:tc>
+          <w:tcPr>
+            <w:tcW w:type="dxa" w:w="3120"/>
+            <w:tcMar>
+              <w:top w:type="dxa" w:w="80"/>
+              <w:left w:type="dxa" w:w="120"/>
+              <w:bottom w:type="dxa" w:w="80"/>
+              <w:right w:type="dxa" w:w="120"/>
+            </w:tcMar>
+          </w:tcPr>
+          <w:p>
+            <w:r>
+              <w:rPr>
+                <w:b w:val="false"/>
+                <w:bCs w:val="false"/>
+                <w:color w:val="000000"/>
+                <w:sz w:val="21"/>
+                <w:szCs w:val="21"/>
+              </w:rPr>
+              <w:t xml:space="preserve">Pilot — t3.large (2 vCPU, 8 GB) + 60 GB gp3 + public IP</w:t>
+            </w:r>
+          </w:p>
+        </w:tc>
+        <w:tc>
+          <w:tcPr>
+            <w:tcW w:type="dxa" w:w="2080"/>
+            <w:tcMar>
+              <w:top w:type="dxa" w:w="80"/>
+              <w:left w:type="dxa" w:w="120"/>
+              <w:bottom w:type="dxa" w:w="80"/>
+              <w:right w:type="dxa" w:w="120"/>
+            </w:tcMar>
+          </w:tcPr>
+          <w:p>
+            <w:r>
+              <w:rPr>
+                <w:b w:val="false"/>
+                <w:bCs w:val="false"/>
+                <w:color w:val="000000"/>
+                <w:sz w:val="21"/>
+                <w:szCs w:val="21"/>
+              </w:rPr>
+              <w:t xml:space="preserve">~$0.09  (₹8)</w:t>
+            </w:r>
+          </w:p>
+        </w:tc>
+        <w:tc>
+          <w:tcPr>
+            <w:tcW w:type="dxa" w:w="2080"/>
+            <w:tcMar>
+              <w:top w:type="dxa" w:w="80"/>
+              <w:left w:type="dxa" w:w="120"/>
+              <w:bottom w:type="dxa" w:w="80"/>
+              <w:right w:type="dxa" w:w="120"/>
+            </w:tcMar>
+          </w:tcPr>
+          <w:p>
+            <w:r>
+              <w:rPr>
+                <w:b w:val="false"/>
+                <w:bCs w:val="false"/>
+                <w:color w:val="000000"/>
+                <w:sz w:val="21"/>
+                <w:szCs w:val="21"/>
+              </w:rPr>
+              <w:t xml:space="preserve">~$2.30  (₹195)</w:t>
+            </w:r>
+          </w:p>
+        </w:tc>
+        <w:tc>
+          <w:tcPr>
+            <w:tcW w:type="dxa" w:w="2080"/>
+            <w:tcMar>
+              <w:top w:type="dxa" w:w="80"/>
+              <w:left w:type="dxa" w:w="120"/>
+              <w:bottom w:type="dxa" w:w="80"/>
+              <w:right w:type="dxa" w:w="120"/>
+            </w:tcMar>
+          </w:tcPr>
+          <w:p>
+            <w:r>
+              <w:rPr>
+                <w:b w:val="false"/>
+                <w:bCs w:val="false"/>
+                <w:color w:val="000000"/>
+                <w:sz w:val="21"/>
+                <w:szCs w:val="21"/>
+              </w:rPr>
+              <w:t xml:space="preserve">~$69  (₹5,800)</w:t>
+            </w:r>
+          </w:p>
+        </w:tc>
+      </w:tr>
+      <w:tr>
+        <w:tc>
+          <w:tcPr>
+            <w:tcW w:type="dxa" w:w="3120"/>
+            <w:shd w:fill="F2F6FB" w:val="clear"/>
+            <w:tcMar>
+              <w:top w:type="dxa" w:w="80"/>
+              <w:left w:type="dxa" w:w="120"/>
+              <w:bottom w:type="dxa" w:w="80"/>
+              <w:right w:type="dxa" w:w="120"/>
+            </w:tcMar>
+          </w:tcPr>
+          <w:p>
+            <w:r>
+              <w:rPr>
+                <w:b w:val="false"/>
+                <w:bCs w:val="false"/>
+                <w:color w:val="000000"/>
+                <w:sz w:val="21"/>
+                <w:szCs w:val="21"/>
+              </w:rPr>
+              <w:t xml:space="preserve">Production — t3.xlarge (4 vCPU, 16 GB) + 100 GB gp3</w:t>
+            </w:r>
+          </w:p>
+        </w:tc>
+        <w:tc>
+          <w:tcPr>
+            <w:tcW w:type="dxa" w:w="2080"/>
+            <w:shd w:fill="F2F6FB" w:val="clear"/>
+            <w:tcMar>
+              <w:top w:type="dxa" w:w="80"/>
+              <w:left w:type="dxa" w:w="120"/>
+              <w:bottom w:type="dxa" w:w="80"/>
+              <w:right w:type="dxa" w:w="120"/>
+            </w:tcMar>
+          </w:tcPr>
+          <w:p>
+            <w:r>
+              <w:rPr>
+                <w:b w:val="false"/>
+                <w:bCs w:val="false"/>
+                <w:color w:val="000000"/>
+                <w:sz w:val="21"/>
+                <w:szCs w:val="21"/>
+              </w:rPr>
+              <w:t xml:space="preserve">~$0.18  (₹15)</w:t>
+            </w:r>
+          </w:p>
+        </w:tc>
+        <w:tc>
+          <w:tcPr>
+            <w:tcW w:type="dxa" w:w="2080"/>
+            <w:shd w:fill="F2F6FB" w:val="clear"/>
+            <w:tcMar>
+              <w:top w:type="dxa" w:w="80"/>
+              <w:left w:type="dxa" w:w="120"/>
+              <w:bottom w:type="dxa" w:w="80"/>
+              <w:right w:type="dxa" w:w="120"/>
+            </w:tcMar>
+          </w:tcPr>
+          <w:p>
+            <w:r>
+              <w:rPr>
+                <w:b w:val="false"/>
+                <w:bCs w:val="false"/>
+                <w:color w:val="000000"/>
+                <w:sz w:val="21"/>
+                <w:szCs w:val="21"/>
+              </w:rPr>
+              <w:t xml:space="preserve">~$4.30  (₹360)</w:t>
+            </w:r>
+          </w:p>
+        </w:tc>
+        <w:tc>
+          <w:tcPr>
+            <w:tcW w:type="dxa" w:w="2080"/>
+            <w:shd w:fill="F2F6FB" w:val="clear"/>
+            <w:tcMar>
+              <w:top w:type="dxa" w:w="80"/>
+              <w:left w:type="dxa" w:w="120"/>
+              <w:bottom w:type="dxa" w:w="80"/>
+              <w:right w:type="dxa" w:w="120"/>
+            </w:tcMar>
+          </w:tcPr>
+          <w:p>
+            <w:r>
+              <w:rPr>
+                <w:b w:val="false"/>
+                <w:bCs w:val="false"/>
+                <w:color w:val="000000"/>
+                <w:sz w:val="21"/>
+                <w:szCs w:val="21"/>
+              </w:rPr>
+              <w:t xml:space="preserve">~$130  (₹10,900)</w:t>
+            </w:r>
+          </w:p>
+        </w:tc>
+      </w:tr>
+      <w:tr>
+        <w:tc>
+          <w:tcPr>
+            <w:tcW w:type="dxa" w:w="3120"/>
+            <w:tcMar>
+              <w:top w:type="dxa" w:w="80"/>
+              <w:left w:type="dxa" w:w="120"/>
+              <w:bottom w:type="dxa" w:w="80"/>
+              <w:right w:type="dxa" w:w="120"/>
+            </w:tcMar>
+          </w:tcPr>
+          <w:p>
+            <w:r>
+              <w:rPr>
+                <w:b w:val="false"/>
+                <w:bCs w:val="false"/>
+                <w:color w:val="000000"/>
+                <w:sz w:val="21"/>
+                <w:szCs w:val="21"/>
+              </w:rPr>
+              <w:t xml:space="preserve">Heavy — m6i.2xlarge (8 vCPU, 32 GB) + 200 GB gp3</w:t>
+            </w:r>
+          </w:p>
+        </w:tc>
+        <w:tc>
+          <w:tcPr>
+            <w:tcW w:type="dxa" w:w="2080"/>
+            <w:tcMar>
+              <w:top w:type="dxa" w:w="80"/>
+              <w:left w:type="dxa" w:w="120"/>
+              <w:bottom w:type="dxa" w:w="80"/>
+              <w:right w:type="dxa" w:w="120"/>
+            </w:tcMar>
+          </w:tcPr>
+          <w:p>
+            <w:r>
+              <w:rPr>
+                <w:b w:val="false"/>
+                <w:bCs w:val="false"/>
+                <w:color w:val="000000"/>
+                <w:sz w:val="21"/>
+                <w:szCs w:val="21"/>
+              </w:rPr>
+              <w:t xml:space="preserve">~$0.42  (₹35)</w:t>
+            </w:r>
+          </w:p>
+        </w:tc>
+        <w:tc>
+          <w:tcPr>
+            <w:tcW w:type="dxa" w:w="2080"/>
+            <w:tcMar>
+              <w:top w:type="dxa" w:w="80"/>
+              <w:left w:type="dxa" w:w="120"/>
+              <w:bottom w:type="dxa" w:w="80"/>
+              <w:right w:type="dxa" w:w="120"/>
+            </w:tcMar>
+          </w:tcPr>
+          <w:p>
+            <w:r>
+              <w:rPr>
+                <w:b w:val="false"/>
+                <w:bCs w:val="false"/>
+                <w:color w:val="000000"/>
+                <w:sz w:val="21"/>
+                <w:szCs w:val="21"/>
+              </w:rPr>
+              <w:t xml:space="preserve">~$10  (₹850)</w:t>
+            </w:r>
+          </w:p>
+        </w:tc>
+        <w:tc>
+          <w:tcPr>
+            <w:tcW w:type="dxa" w:w="2080"/>
+            <w:tcMar>
+              <w:top w:type="dxa" w:w="80"/>
+              <w:left w:type="dxa" w:w="120"/>
+              <w:bottom w:type="dxa" w:w="80"/>
+              <w:right w:type="dxa" w:w="120"/>
+            </w:tcMar>
+          </w:tcPr>
+          <w:p>
+            <w:r>
+              <w:rPr>
+                <w:b w:val="false"/>
+                <w:bCs w:val="false"/>
+                <w:color w:val="000000"/>
+                <w:sz w:val="21"/>
+                <w:szCs w:val="21"/>
+              </w:rPr>
+              <w:t xml:space="preserve">~$305  (₹25,600)</w:t>
+            </w:r>
+          </w:p>
+        </w:tc>
+      </w:tr>
+      <w:tr>
+        <w:tc>
+          <w:tcPr>
+            <w:tcW w:type="dxa" w:w="3120"/>
+            <w:shd w:fill="F2F6FB" w:val="clear"/>
+            <w:tcMar>
+              <w:top w:type="dxa" w:w="80"/>
+              <w:left w:type="dxa" w:w="120"/>
+              <w:bottom w:type="dxa" w:w="80"/>
+              <w:right w:type="dxa" w:w="120"/>
+            </w:tcMar>
+          </w:tcPr>
+          <w:p>
+            <w:r>
+              <w:rPr>
+                <w:b w:val="false"/>
+                <w:bCs w:val="false"/>
+                <w:color w:val="000000"/>
+                <w:sz w:val="21"/>
+                <w:szCs w:val="21"/>
+              </w:rPr>
+              <w:t xml:space="preserve">Stopped (any tier) — data retained on EBS</w:t>
+            </w:r>
+          </w:p>
+        </w:tc>
+        <w:tc>
+          <w:tcPr>
+            <w:tcW w:type="dxa" w:w="2080"/>
+            <w:shd w:fill="F2F6FB" w:val="clear"/>
+            <w:tcMar>
+              <w:top w:type="dxa" w:w="80"/>
+              <w:left w:type="dxa" w:w="120"/>
+              <w:bottom w:type="dxa" w:w="80"/>
+              <w:right w:type="dxa" w:w="120"/>
+            </w:tcMar>
+          </w:tcPr>
+          <w:p>
+            <w:r>
+              <w:rPr>
+                <w:b w:val="false"/>
+                <w:bCs w:val="false"/>
+                <w:color w:val="000000"/>
+                <w:sz w:val="21"/>
+                <w:szCs w:val="21"/>
+              </w:rPr>
+              <w:t xml:space="preserve">~$0.01  (₹0.6)</w:t>
+            </w:r>
+          </w:p>
+        </w:tc>
+        <w:tc>
+          <w:tcPr>
+            <w:tcW w:type="dxa" w:w="2080"/>
+            <w:shd w:fill="F2F6FB" w:val="clear"/>
+            <w:tcMar>
+              <w:top w:type="dxa" w:w="80"/>
+              <w:left w:type="dxa" w:w="120"/>
+              <w:bottom w:type="dxa" w:w="80"/>
+              <w:right w:type="dxa" w:w="120"/>
+            </w:tcMar>
+          </w:tcPr>
+          <w:p>
+            <w:r>
+              <w:rPr>
+                <w:b w:val="false"/>
+                <w:bCs w:val="false"/>
+                <w:color w:val="000000"/>
+                <w:sz w:val="21"/>
+                <w:szCs w:val="21"/>
+              </w:rPr>
+              <w:t xml:space="preserve">~$0.16–0.55 (₹14–46)</w:t>
+            </w:r>
+          </w:p>
+        </w:tc>
+        <w:tc>
+          <w:tcPr>
+            <w:tcW w:type="dxa" w:w="2080"/>
+            <w:shd w:fill="F2F6FB" w:val="clear"/>
+            <w:tcMar>
+              <w:top w:type="dxa" w:w="80"/>
+              <w:left w:type="dxa" w:w="120"/>
+              <w:bottom w:type="dxa" w:w="80"/>
+              <w:right w:type="dxa" w:w="120"/>
+            </w:tcMar>
+          </w:tcPr>
+          <w:p>
+            <w:r>
+              <w:rPr>
+                <w:b w:val="false"/>
+                <w:bCs w:val="false"/>
+                <w:color w:val="000000"/>
+                <w:sz w:val="21"/>
+                <w:szCs w:val="21"/>
+              </w:rPr>
+              <w:t xml:space="preserve">~$5–17  (₹420–1,400)</w:t>
+            </w:r>
+          </w:p>
+        </w:tc>
+      </w:tr>
+    </w:tbl>
+    <w:p>
+      <w:pPr>
+        <w:spacing w:after="120" w:before="120"/>
+      </w:pPr>
+      <w:r>
+        <w:rPr>
+          <w:i/>
+          <w:iCs/>
+          <w:color w:val="595959"/>
+          <w:sz w:val="20"/>
+          <w:szCs w:val="20"/>
+        </w:rPr>
+        <w:t xml:space="preserve">For perspective: even the production tier costs less per month than a few hours of the engineering time an internal build consumes — and a pilot evaluation (a working day, then destroyed) costs under $1. Marketplace software pricing (hourly/annual) is additional and listed on the AWS Marketplace listing: [pricing TBD]. Prices vary slightly by region and change over time; confirm current rates via the AWS pricing calculator.</w:t>
+      </w:r>
+    </w:p>
+    <w:p>
+      <w:pPr>
+        <w:pStyle w:val="Heading1"/>
+        <w:spacing w:after="120" w:before="300"/>
+      </w:pPr>
+      <w:r>
+        <w:rPr>
+          <w:color w:val="1F3864"/>
+        </w:rPr>
         <w:t xml:space="preserve">Results</w:t>
       </w:r>
     </w:p>
@@ -1187,6 +1727,170 @@
           <w:szCs w:val="22"/>
         </w:rPr>
         <w:t xml:space="preserve">All observability data remains in the customer's AWS account, satisfying the compliance requirement that blocked SaaS alternatives.</w:t>
+      </w:r>
+    </w:p>
+    <w:p>
+      <w:pPr>
+        <w:pStyle w:val="Heading1"/>
+        <w:spacing w:after="120" w:before="300"/>
+      </w:pPr>
+      <w:r>
+        <w:rPr>
+          <w:color w:val="1F3864"/>
+        </w:rPr>
+        <w:t xml:space="preserve">Deployment Validation (Trigent AI-BU, July 2026)</w:t>
+      </w:r>
+    </w:p>
+    <w:p>
+      <w:pPr>
+        <w:spacing w:after="120"/>
+      </w:pPr>
+      <w:r>
+        <w:rPr>
+          <w:sz w:val="22"/>
+          <w:szCs w:val="22"/>
+        </w:rPr>
+        <w:t xml:space="preserve">Unlike the illustrative customer figures above, the following results are real: they were produced by Trigent's own end-to-end validation of this stack on AWS (ap-south-1 and us-east-1), deployed from the exact Terraform in the product repository.</w:t>
+      </w:r>
+    </w:p>
+    <w:p>
+      <w:pPr>
+        <w:pStyle w:val="ListParagraph"/>
+        <w:numPr>
+          <w:ilvl w:val="0"/>
+          <w:numId w:val="2"/>
+        </w:numPr>
+        <w:spacing w:after="80"/>
+      </w:pPr>
+      <w:r>
+        <w:rPr>
+          <w:b/>
+          <w:bCs/>
+          <w:sz w:val="22"/>
+          <w:szCs w:val="22"/>
+        </w:rPr>
+        <w:t xml:space="preserve">Provisioning — </w:t>
+      </w:r>
+      <w:r>
+        <w:rPr>
+          <w:sz w:val="22"/>
+          <w:szCs w:val="22"/>
+        </w:rPr>
+        <w:t xml:space="preserve">One `terraform apply` to a live stack in ~8 minutes: EC2 + encrypted EBS + security group, with all credentials generated at first boot — nothing hardcoded.</w:t>
+      </w:r>
+    </w:p>
+    <w:p>
+      <w:pPr>
+        <w:pStyle w:val="ListParagraph"/>
+        <w:numPr>
+          <w:ilvl w:val="0"/>
+          <w:numId w:val="2"/>
+        </w:numPr>
+        <w:spacing w:after="80"/>
+      </w:pPr>
+      <w:r>
+        <w:rPr>
+          <w:b/>
+          <w:bCs/>
+          <w:sz w:val="22"/>
+          <w:szCs w:val="22"/>
+        </w:rPr>
+        <w:t xml:space="preserve">Ingestion — </w:t>
+      </w:r>
+      <w:r>
+        <w:rPr>
+          <w:sz w:val="22"/>
+          <w:szCs w:val="22"/>
+        </w:rPr>
+        <w:t xml:space="preserve">200 synthetic LLM traces ingested across four models (GPT-4o, GPT-4o-mini, Claude Sonnet, Amazon Nova) via the Langfuse ingestion API — 100% acceptance, zero errors.</w:t>
+      </w:r>
+    </w:p>
+    <w:p>
+      <w:pPr>
+        <w:pStyle w:val="ListParagraph"/>
+        <w:numPr>
+          <w:ilvl w:val="0"/>
+          <w:numId w:val="2"/>
+        </w:numPr>
+        <w:spacing w:after="80"/>
+      </w:pPr>
+      <w:r>
+        <w:rPr>
+          <w:b/>
+          <w:bCs/>
+          <w:sz w:val="22"/>
+          <w:szCs w:val="22"/>
+        </w:rPr>
+        <w:t xml:space="preserve">Automated evals — </w:t>
+      </w:r>
+      <w:r>
+        <w:rPr>
+          <w:sz w:val="22"/>
+          <w:szCs w:val="22"/>
+        </w:rPr>
+        <w:t xml:space="preserve">364 evaluation scores attached automatically by the eval-hooks worker with no human action: 21 refusals detected, 12 latency-SLO breaches flagged, 1 per-trace cost-budget breach caught, 28 empty outputs identified.</w:t>
+      </w:r>
+    </w:p>
+    <w:p>
+      <w:pPr>
+        <w:pStyle w:val="ListParagraph"/>
+        <w:numPr>
+          <w:ilvl w:val="0"/>
+          <w:numId w:val="2"/>
+        </w:numPr>
+        <w:spacing w:after="80"/>
+      </w:pPr>
+      <w:r>
+        <w:rPr>
+          <w:b/>
+          <w:bCs/>
+          <w:sz w:val="22"/>
+          <w:szCs w:val="22"/>
+        </w:rPr>
+        <w:t xml:space="preserve">Cost visibility — </w:t>
+      </w:r>
+      <w:r>
+        <w:rPr>
+          <w:sz w:val="22"/>
+          <w:szCs w:val="22"/>
+        </w:rPr>
+        <w:t xml:space="preserve">$1.45 of LLM spend attributed per model on the pre-built Grafana dashboard — spend over time, spend by model, 695K tokens, p95 latency, and a ranked most-expensive-traces table, live within a minute of ingestion.</w:t>
+      </w:r>
+    </w:p>
+    <w:p>
+      <w:pPr>
+        <w:spacing w:after="120"/>
+      </w:pPr>
+      <w:r>
+        <w:rPr>
+          <w:sz w:val="22"/>
+          <w:szCs w:val="22"/>
+        </w:rPr>
+        <w:t xml:space="preserve">[Insert screenshot: Langfuse project home — traces, model costs, scores]</w:t>
+      </w:r>
+    </w:p>
+    <w:p>
+      <w:pPr>
+        <w:spacing w:after="120"/>
+      </w:pPr>
+      <w:r>
+        <w:rPr>
+          <w:sz w:val="22"/>
+          <w:szCs w:val="22"/>
+        </w:rPr>
+        <w:t xml:space="preserve">[Insert screenshot: Langfuse trace detail with attached eval scores]</w:t>
+      </w:r>
+    </w:p>
+    <w:p>
+      <w:pPr>
+        <w:spacing w:after="120"/>
+      </w:pPr>
+      <w:r>
+        <w:rPr>
+          <w:sz w:val="22"/>
+          <w:szCs w:val="22"/>
+        </w:rPr>
+        <w:t xml:space="preserve">[Insert screenshot: Grafana LLM Cost &amp; Usage dashboard]</w:t>
       </w:r>
     </w:p>
     <w:p>

</xml_diff>

<commit_message>
Eval worker: paginate full trace list; case study aligned with delivery reality
</commit_message>
<xml_diff>
--- a/docs/AI-Observability-Case-Study.docx
+++ b/docs/AI-Observability-Case-Study.docx
@@ -62,7 +62,7 @@
           <w:sz w:val="19"/>
           <w:szCs w:val="19"/>
         </w:rPr>
-        <w:t xml:space="preserve">ILLUSTRATIVE TEMPLATE — figures in [brackets] are placeholders to be replaced with a real engagement before external use.</w:t>
+        <w:t xml:space="preserve">ILLUSTRATIVE TEMPLATE — figures in [brackets] are placeholders. Delivery status: product AMI built and verified (us-east-1); AWS Marketplace listing IN PROGRESS — customers deploy today via the provided Terraform/CloudFormation.</w:t>
       </w:r>
     </w:p>
     <w:p>
@@ -288,7 +288,7 @@
                 <w:sz w:val="21"/>
                 <w:szCs w:val="21"/>
               </w:rPr>
-              <w:t xml:space="preserve">Trigent AI Observability Stack — single-AMI deployment from AWS Marketplace</w:t>
+              <w:t xml:space="preserve">Trigent AI Observability Stack — single-AMI product (AMI built and verified; AWS Marketplace listing in progress — deployable today via Terraform/CloudFormation)</w:t>
             </w:r>
           </w:p>
         </w:tc>
@@ -388,7 +388,7 @@
                 <w:sz w:val="21"/>
                 <w:szCs w:val="21"/>
               </w:rPr>
-              <w:t xml:space="preserve">Under 30 minutes from Marketplace subscribe to first trace</w:t>
+              <w:t xml:space="preserve">Instance launch to running stack: 94 seconds (measured on the verified AMI); first traces on dashboards within minutes</w:t>
             </w:r>
           </w:p>
         </w:tc>
@@ -438,7 +438,7 @@
                 <w:sz w:val="21"/>
                 <w:szCs w:val="21"/>
               </w:rPr>
-              <w:t xml:space="preserve">[38%] reduction in monthly LLM spend · [100%] of production traces auto-evaluated · [3 weeks] of platform build effort avoided</w:t>
+              <w:t xml:space="preserve">[38%] reduction in monthly LLM spend · every ingested trace auto-evaluated · [3 weeks] of platform build effort avoided</w:t>
             </w:r>
           </w:p>
         </w:tc>
@@ -477,7 +477,7 @@
           <w:sz w:val="22"/>
           <w:szCs w:val="22"/>
         </w:rPr>
-        <w:t xml:space="preserve">Trigent's AI Observability Stack packages the answer as a one-click AWS Marketplace AMI: Langfuse tracing, pre-built LLM cost dashboards, and an automated evaluation preset — pre-integrated, secured at first boot, and running inside the customer's own AWS account so no prompt or completion data ever leaves their VPC.</w:t>
+        <w:t xml:space="preserve">Trigent's AI Observability Stack packages the answer as a one-click AMI (AWS Marketplace listing in progress; Terraform/CloudFormation available today): Langfuse tracing, pre-built LLM cost dashboards, and an automated evaluation preset — pre-integrated, secured at first boot, and running inside the customer's own AWS account so no prompt or completion data ever leaves their VPC.</w:t>
       </w:r>
     </w:p>
     <w:p>
@@ -617,7 +617,7 @@
           <w:sz w:val="22"/>
           <w:szCs w:val="22"/>
         </w:rPr>
-        <w:t xml:space="preserve">The customer subscribed to the AI Observability Stack on AWS Marketplace and launched the AMI into a private subnet. Everything below ships pre-wired:</w:t>
+        <w:t xml:space="preserve">The customer launched the AI Observability Stack AMI into a private subnet in their own AWS account (via AWS Marketplace once listed; via the provided CloudFormation or Terraform today). Everything below ships pre-wired:</w:t>
       </w:r>
     </w:p>
     <w:p>
@@ -867,7 +867,7 @@
                 <w:sz w:val="21"/>
                 <w:szCs w:val="21"/>
               </w:rPr>
-              <w:t xml:space="preserve">AMI (us-east-1 master, cloned to enabled regions)</w:t>
+              <w:t xml:space="preserve">AMI — built and verified: ami-082e9452f2aff9f99 (us-east-1). Marketplace listing in progress; on publication AWS clones it to enabled regions</w:t>
             </w:r>
           </w:p>
         </w:tc>
@@ -917,7 +917,7 @@
                 <w:sz w:val="21"/>
                 <w:szCs w:val="21"/>
               </w:rPr>
-              <w:t xml:space="preserve">1-click launch or Terraform module (provided) · ~8 minutes to running stack</w:t>
+              <w:t xml:space="preserve">CloudFormation or Terraform (provided, available today); Marketplace 1-click on listing. Launch to running stack: 94 seconds measured on the AMI (~8 min for Terraform test harness, which installs at boot)</w:t>
             </w:r>
           </w:p>
         </w:tc>
@@ -1750,7 +1750,7 @@
           <w:sz w:val="22"/>
           <w:szCs w:val="22"/>
         </w:rPr>
-        <w:t xml:space="preserve">Unlike the illustrative customer figures above, the following results are real: they were produced by Trigent's own end-to-end validation of this stack on AWS (ap-south-1 and us-east-1), deployed from the exact Terraform in the product repository.</w:t>
+        <w:t xml:space="preserve">Unlike the illustrative customer figures above, the following results are real: they were produced by Trigent's own end-to-end validation on AWS (ap-south-1 and us-east-1), deployed from the exact Terraform in the product repository and, for AMI verification, from the built product AMI itself.</w:t>
       </w:r>
     </w:p>
     <w:p>
@@ -1828,7 +1828,33 @@
           <w:sz w:val="22"/>
           <w:szCs w:val="22"/>
         </w:rPr>
-        <w:t xml:space="preserve">364 evaluation scores attached automatically by the eval-hooks worker with no human action: 21 refusals detected, 12 latency-SLO breaches flagged, 1 per-trace cost-budget breach caught, 28 empty outputs identified.</w:t>
+        <w:t xml:space="preserve">scores attached automatically by the eval-hooks worker with no human action; at capture, 91 traces carried 364 scores including 21 detected refusals, 12 latency-SLO breaches, 1 cost-budget breach and 28 empty outputs. The worker initially processed only the newest 50 traces per cycle; it now paginates the full trace list each cycle so every ingested trace is evaluated. [Re-run after the fix and insert final counts.]</w:t>
+      </w:r>
+    </w:p>
+    <w:p>
+      <w:pPr>
+        <w:pStyle w:val="ListParagraph"/>
+        <w:numPr>
+          <w:ilvl w:val="0"/>
+          <w:numId w:val="2"/>
+        </w:numPr>
+        <w:spacing w:after="80"/>
+      </w:pPr>
+      <w:r>
+        <w:rPr>
+          <w:b/>
+          <w:bCs/>
+          <w:sz w:val="22"/>
+          <w:szCs w:val="22"/>
+        </w:rPr>
+        <w:t xml:space="preserve">AMI verification — </w:t>
+      </w:r>
+      <w:r>
+        <w:rPr>
+          <w:sz w:val="22"/>
+          <w:szCs w:val="22"/>
+        </w:rPr>
+        <w:t xml:space="preserve">a test instance launched from the built AMI (ami-082e9452f2aff9f99) reached a fully running stack in 94 seconds, with all credentials generated fresh at first boot and the first-boot service completing cleanly (systemd status 0/SUCCESS).</w:t>
       </w:r>
     </w:p>
     <w:p>

</xml_diff>

<commit_message>
Validation finalized: 800 scores / 200 traces, 100% eval coverage
</commit_message>
<xml_diff>
--- a/docs/AI-Observability-Case-Study.docx
+++ b/docs/AI-Observability-Case-Study.docx
@@ -867,7 +867,7 @@
                 <w:sz w:val="21"/>
                 <w:szCs w:val="21"/>
               </w:rPr>
-              <w:t xml:space="preserve">AMI — built and verified: ami-082e9452f2aff9f99 (us-east-1). Marketplace listing in progress; on publication AWS clones it to enabled regions</w:t>
+              <w:t xml:space="preserve">AMI — built and verified: ami-082e9452f2aff9f99 (us-east-1); v1.0.1 rebuild with the updated eval worker precedes submission. Marketplace listing in progress; on publication AWS clones it to enabled regions</w:t>
             </w:r>
           </w:p>
         </w:tc>
@@ -1802,7 +1802,7 @@
           <w:sz w:val="22"/>
           <w:szCs w:val="22"/>
         </w:rPr>
-        <w:t xml:space="preserve">200 synthetic LLM traces ingested across four models (GPT-4o, GPT-4o-mini, Claude Sonnet, Amazon Nova) via the Langfuse ingestion API — 100% acceptance, zero errors.</w:t>
+        <w:t xml:space="preserve">200 synthetic LLM traces (400 events) ingested across four models (GPT-4o, GPT-4o-mini, Claude Sonnet, Amazon Nova) via the Langfuse ingestion API — 100% acceptance, zero errors.</w:t>
       </w:r>
     </w:p>
     <w:p>
@@ -1828,7 +1828,7 @@
           <w:sz w:val="22"/>
           <w:szCs w:val="22"/>
         </w:rPr>
-        <w:t xml:space="preserve">scores attached automatically by the eval-hooks worker with no human action; at capture, 91 traces carried 364 scores including 21 detected refusals, 12 latency-SLO breaches, 1 cost-budget breach and 28 empty outputs. The worker initially processed only the newest 50 traces per cycle; it now paginates the full trace list each cycle so every ingested trace is evaluated. [Re-run after the fix and insert final counts.]</w:t>
+        <w:t xml:space="preserve">800 evaluation scores attached automatically with no human action — all 4 checks on all 200 traces (100% coverage, verified after the worker was updated to paginate the full trace list each cycle): 53 refusals detected, 59 latency-SLO breaches flagged, 6 per-trace cost-budget breaches caught, 53 empty outputs identified.</w:t>
       </w:r>
     </w:p>
     <w:p>
@@ -1880,7 +1880,7 @@
           <w:sz w:val="22"/>
           <w:szCs w:val="22"/>
         </w:rPr>
-        <w:t xml:space="preserve">$1.45 of LLM spend attributed per model on the pre-built Grafana dashboard — spend over time, spend by model, 695K tokens, p95 latency, and a ranked most-expensive-traces table, live within a minute of ingestion.</w:t>
+        <w:t xml:space="preserve">$3.34 of LLM spend attributed per model on the pre-built Grafana dashboard (claude-sonnet $1.76, gpt-4o $1.14, nova-pro $0.37, gpt-4o-mini $0.07) — 921K tokens, spend over time, p95 latency and a ranked most-expensive-traces table, live within a minute of ingestion.</w:t>
       </w:r>
     </w:p>
     <w:p>

</xml_diff>

<commit_message>
Case study final: v1.0.1 AMI + validation screenshots embedded
</commit_message>
<xml_diff>
--- a/docs/AI-Observability-Case-Study.docx
+++ b/docs/AI-Observability-Case-Study.docx
@@ -867,7 +867,7 @@
                 <w:sz w:val="21"/>
                 <w:szCs w:val="21"/>
               </w:rPr>
-              <w:t xml:space="preserve">AMI — built and verified: ami-082e9452f2aff9f99 (us-east-1); v1.0.1 rebuild with the updated eval worker precedes submission. Marketplace listing in progress; on publication AWS clones it to enabled regions</w:t>
+              <w:t xml:space="preserve">AMI v1.0.1 — built and verified: ami-01cf0c6d9f8f31233 (us-east-1), including the paginated eval worker. Marketplace listing in progress; on publication AWS clones it to enabled regions</w:t>
             </w:r>
           </w:p>
         </w:tc>
@@ -1854,7 +1854,7 @@
           <w:sz w:val="22"/>
           <w:szCs w:val="22"/>
         </w:rPr>
-        <w:t xml:space="preserve">a test instance launched from the built AMI (ami-082e9452f2aff9f99) reached a fully running stack in 94 seconds, with all credentials generated fresh at first boot and the first-boot service completing cleanly (systemd status 0/SUCCESS).</w:t>
+        <w:t xml:space="preserve">a test instance launched from the built AMI reached a fully running stack in 94 seconds, with all credentials generated fresh at first boot and the first-boot service completing cleanly (systemd status 0/SUCCESS). Current product image: v1.0.1 (ami-01cf0c6d9f8f31233), which differs from the measured build only by the eval-worker pagination fix.</w:t>
       </w:r>
     </w:p>
     <w:p>
@@ -1885,38 +1885,126 @@
     </w:p>
     <w:p>
       <w:pPr>
-        <w:spacing w:after="120"/>
-      </w:pPr>
-      <w:r>
-        <w:rPr>
-          <w:sz w:val="22"/>
-          <w:szCs w:val="22"/>
-        </w:rPr>
-        <w:t xml:space="preserve">[Insert screenshot: Langfuse project home — traces, model costs, scores]</w:t>
-      </w:r>
-    </w:p>
-    <w:p>
-      <w:pPr>
-        <w:spacing w:after="120"/>
-      </w:pPr>
-      <w:r>
-        <w:rPr>
-          <w:sz w:val="22"/>
-          <w:szCs w:val="22"/>
-        </w:rPr>
-        <w:t xml:space="preserve">[Insert screenshot: Langfuse trace detail with attached eval scores]</w:t>
-      </w:r>
-    </w:p>
-    <w:p>
-      <w:pPr>
-        <w:spacing w:after="120"/>
-      </w:pPr>
-      <w:r>
-        <w:rPr>
-          <w:sz w:val="22"/>
-          <w:szCs w:val="22"/>
-        </w:rPr>
-        <w:t xml:space="preserve">[Insert screenshot: Grafana LLM Cost &amp; Usage dashboard]</w:t>
+        <w:spacing w:after="60" w:before="120"/>
+        <w:jc w:val="center"/>
+      </w:pPr>
+      <w:r>
+        <w:drawing>
+          <wp:inline distT="0" distB="0" distL="0" distR="0">
+            <wp:extent cx="6096000" cy="3162300"/>
+            <wp:effectExtent t="0" r="0" b="0" l="0"/>
+            <wp:docPr id="1" name="" descr="" title=""/>
+            <wp:cNvGraphicFramePr>
+              <a:graphicFrameLocks xmlns:a="http://schemas.openxmlformats.org/drawingml/2006/main" noChangeAspect="1"/>
+            </wp:cNvGraphicFramePr>
+            <a:graphic xmlns:a="http://schemas.openxmlformats.org/drawingml/2006/main">
+              <a:graphicData uri="http://schemas.openxmlformats.org/drawingml/2006/picture">
+                <pic:pic xmlns:pic="http://schemas.openxmlformats.org/drawingml/2006/picture">
+                  <pic:nvPicPr>
+                    <pic:cNvPr id="0" name="" descr=""/>
+                    <pic:cNvPicPr>
+                      <a:picLocks noChangeAspect="1" noChangeArrowheads="1"/>
+                    </pic:cNvPicPr>
+                  </pic:nvPicPr>
+                  <pic:blipFill>
+                    <a:blip r:embed="rId8" cstate="none"/>
+                    <a:srcRect/>
+                    <a:stretch>
+                      <a:fillRect/>
+                    </a:stretch>
+                  </pic:blipFill>
+                  <pic:spPr bwMode="auto">
+                    <a:xfrm>
+                      <a:off x="0" y="0"/>
+                      <a:ext cx="6096000" cy="3162300"/>
+                    </a:xfrm>
+                    <a:prstGeom prst="rect">
+                      <a:avLst/>
+                    </a:prstGeom>
+                  </pic:spPr>
+                </pic:pic>
+              </a:graphicData>
+            </a:graphic>
+          </wp:inline>
+        </w:drawing>
+      </w:r>
+    </w:p>
+    <w:p>
+      <w:pPr>
+        <w:spacing w:after="160"/>
+        <w:jc w:val="center"/>
+      </w:pPr>
+      <w:r>
+        <w:rPr>
+          <w:i/>
+          <w:iCs/>
+          <w:color w:val="595959"/>
+          <w:sz w:val="18"/>
+          <w:szCs w:val="18"/>
+        </w:rPr>
+        <w:t xml:space="preserve">Langfuse during validation: 200 traces, $3.34 model-cost attribution, 800 automated scores (all four checks at 200/200).</w:t>
+      </w:r>
+    </w:p>
+    <w:p>
+      <w:pPr>
+        <w:spacing w:after="60" w:before="120"/>
+        <w:jc w:val="center"/>
+      </w:pPr>
+      <w:r>
+        <w:drawing>
+          <wp:inline distT="0" distB="0" distL="0" distR="0">
+            <wp:extent cx="6096000" cy="3143250"/>
+            <wp:effectExtent t="0" r="0" b="0" l="0"/>
+            <wp:docPr id="1" name="" descr="" title=""/>
+            <wp:cNvGraphicFramePr>
+              <a:graphicFrameLocks xmlns:a="http://schemas.openxmlformats.org/drawingml/2006/main" noChangeAspect="1"/>
+            </wp:cNvGraphicFramePr>
+            <a:graphic xmlns:a="http://schemas.openxmlformats.org/drawingml/2006/main">
+              <a:graphicData uri="http://schemas.openxmlformats.org/drawingml/2006/picture">
+                <pic:pic xmlns:pic="http://schemas.openxmlformats.org/drawingml/2006/picture">
+                  <pic:nvPicPr>
+                    <pic:cNvPr id="0" name="" descr=""/>
+                    <pic:cNvPicPr>
+                      <a:picLocks noChangeAspect="1" noChangeArrowheads="1"/>
+                    </pic:cNvPicPr>
+                  </pic:nvPicPr>
+                  <pic:blipFill>
+                    <a:blip r:embed="rId9" cstate="none"/>
+                    <a:srcRect/>
+                    <a:stretch>
+                      <a:fillRect/>
+                    </a:stretch>
+                  </pic:blipFill>
+                  <pic:spPr bwMode="auto">
+                    <a:xfrm>
+                      <a:off x="0" y="0"/>
+                      <a:ext cx="6096000" cy="3143250"/>
+                    </a:xfrm>
+                    <a:prstGeom prst="rect">
+                      <a:avLst/>
+                    </a:prstGeom>
+                  </pic:spPr>
+                </pic:pic>
+              </a:graphicData>
+            </a:graphic>
+          </wp:inline>
+        </w:drawing>
+      </w:r>
+    </w:p>
+    <w:p>
+      <w:pPr>
+        <w:spacing w:after="160"/>
+        <w:jc w:val="center"/>
+      </w:pPr>
+      <w:r>
+        <w:rPr>
+          <w:i/>
+          <w:iCs/>
+          <w:color w:val="595959"/>
+          <w:sz w:val="18"/>
+          <w:szCs w:val="18"/>
+        </w:rPr>
+        <w:t xml:space="preserve">Pre-built Grafana dashboard on the same run: total spend, 921K tokens, p95 latency, spend by model, most expensive traces.</w:t>
       </w:r>
     </w:p>
     <w:p>

</xml_diff>